<commit_message>
Actualizacion de proveedores y Actualizacion de la Guia de inicio
</commit_message>
<xml_diff>
--- a/Guia_Inicio_EP2_DSY1103.docx
+++ b/Guia_Inicio_EP2_DSY1103.docx
@@ -1,6 +1,6 @@
 
 <file path=word/document.xml><?xml version="1.0" encoding="utf-8"?>
-<w:document xmlns:wpc="http://schemas.microsoft.com/office/word/2010/wordprocessingCanvas" xmlns:cx="http://schemas.microsoft.com/office/drawing/2014/chartex" xmlns:cx1="http://schemas.microsoft.com/office/drawing/2015/9/8/chartex" xmlns:cx2="http://schemas.microsoft.com/office/drawing/2015/10/21/chartex" xmlns:cx3="http://schemas.microsoft.com/office/drawing/2016/5/9/chartex" xmlns:cx4="http://schemas.microsoft.com/office/drawing/2016/5/10/chartex" xmlns:cx5="http://schemas.microsoft.com/office/drawing/2016/5/11/chartex" xmlns:cx6="http://schemas.microsoft.com/office/drawing/2016/5/12/chartex" xmlns:cx7="http://schemas.microsoft.com/office/drawing/2016/5/13/chartex" xmlns:cx8="http://schemas.microsoft.com/office/drawing/2016/5/14/chartex" xmlns:mc="http://schemas.openxmlformats.org/markup-compatibility/2006" xmlns:aink="http://schemas.microsoft.com/office/drawing/2016/ink" xmlns:am3d="http://schemas.microsoft.com/office/drawing/2017/model3d" xmlns:o="urn:schemas-microsoft-com:office:office" xmlns:r="http://schemas.openxmlformats.org/officeDocument/2006/relationships" xmlns:m="http://schemas.openxmlformats.org/officeDocument/2006/math" xmlns:v="urn:schemas-microsoft-com:vml" xmlns:wp14="http://schemas.microsoft.com/office/word/2010/wordprocessingDrawing" xmlns:wp="http://schemas.openxmlformats.org/drawingml/2006/wordprocessingDrawing" xmlns:w10="urn:schemas-microsoft-com:office:word" xmlns:w="http://schemas.openxmlformats.org/wordprocessingml/2006/main" xmlns:w14="http://schemas.microsoft.com/office/word/2010/wordml" xmlns:w15="http://schemas.microsoft.com/office/word/2012/wordml" xmlns:w16cex="http://schemas.microsoft.com/office/word/2018/wordml/cex" xmlns:w16cid="http://schemas.microsoft.com/office/word/2016/wordml/cid" xmlns:w16="http://schemas.microsoft.com/office/word/2018/wordml" xmlns:w16sdtdh="http://schemas.microsoft.com/office/word/2020/wordml/sdtdatahash" xmlns:w16se="http://schemas.microsoft.com/office/word/2015/wordml/symex" xmlns:wpg="http://schemas.microsoft.com/office/word/2010/wordprocessingGroup" xmlns:wpi="http://schemas.microsoft.com/office/word/2010/wordprocessingInk" xmlns:wne="http://schemas.microsoft.com/office/word/2006/wordml" xmlns:wps="http://schemas.microsoft.com/office/word/2010/wordprocessingShape" mc:Ignorable="w14 w15 w16se w16cid w16 w16cex w16sdtdh wp14">
+<w:document xmlns:wpc="http://schemas.microsoft.com/office/word/2010/wordprocessingCanvas" xmlns:cx="http://schemas.microsoft.com/office/drawing/2014/chartex" xmlns:cx1="http://schemas.microsoft.com/office/drawing/2015/9/8/chartex" xmlns:cx2="http://schemas.microsoft.com/office/drawing/2015/10/21/chartex" xmlns:cx3="http://schemas.microsoft.com/office/drawing/2016/5/9/chartex" xmlns:cx4="http://schemas.microsoft.com/office/drawing/2016/5/10/chartex" xmlns:cx5="http://schemas.microsoft.com/office/drawing/2016/5/11/chartex" xmlns:cx6="http://schemas.microsoft.com/office/drawing/2016/5/12/chartex" xmlns:cx7="http://schemas.microsoft.com/office/drawing/2016/5/13/chartex" xmlns:cx8="http://schemas.microsoft.com/office/drawing/2016/5/14/chartex" xmlns:mc="http://schemas.openxmlformats.org/markup-compatibility/2006" xmlns:aink="http://schemas.microsoft.com/office/drawing/2016/ink" xmlns:am3d="http://schemas.microsoft.com/office/drawing/2017/model3d" xmlns:o="urn:schemas-microsoft-com:office:office" xmlns:oel="http://schemas.microsoft.com/office/2019/extlst" xmlns:r="http://schemas.openxmlformats.org/officeDocument/2006/relationships" xmlns:m="http://schemas.openxmlformats.org/officeDocument/2006/math" xmlns:v="urn:schemas-microsoft-com:vml" xmlns:wp14="http://schemas.microsoft.com/office/word/2010/wordprocessingDrawing" xmlns:wp="http://schemas.openxmlformats.org/drawingml/2006/wordprocessingDrawing" xmlns:w10="urn:schemas-microsoft-com:office:word" xmlns:w="http://schemas.openxmlformats.org/wordprocessingml/2006/main" xmlns:w14="http://schemas.microsoft.com/office/word/2010/wordml" xmlns:w15="http://schemas.microsoft.com/office/word/2012/wordml" xmlns:w16cex="http://schemas.microsoft.com/office/word/2018/wordml/cex" xmlns:w16cid="http://schemas.microsoft.com/office/word/2016/wordml/cid" xmlns:w16="http://schemas.microsoft.com/office/word/2018/wordml" xmlns:w16du="http://schemas.microsoft.com/office/word/2023/wordml/word16du" xmlns:w16sdtdh="http://schemas.microsoft.com/office/word/2020/wordml/sdtdatahash" xmlns:w16sdtfl="http://schemas.microsoft.com/office/word/2024/wordml/sdtformatlock" xmlns:w16se="http://schemas.microsoft.com/office/word/2015/wordml/symex" xmlns:wpg="http://schemas.microsoft.com/office/word/2010/wordprocessingGroup" xmlns:wpi="http://schemas.microsoft.com/office/word/2010/wordprocessingInk" xmlns:wne="http://schemas.microsoft.com/office/word/2006/wordml" xmlns:wps="http://schemas.microsoft.com/office/word/2010/wordprocessingShape" mc:Ignorable="w14 w15 w16se w16cid w16 w16cex w16sdtdh w16sdtfl w16du wp14">
   <w:body>
     <w:p>
       <w:pPr>
@@ -370,17 +370,7 @@
                 <w:sz w:val="20"/>
                 <w:szCs w:val="20"/>
               </w:rPr>
-              <w:t xml:space="preserve">Esta </w:t>
-            </w:r>
-            <w:r>
-              <w:rPr>
-                <w:i/>
-                <w:iCs/>
-                <w:color w:val="1A3A5C"/>
-                <w:sz w:val="20"/>
-                <w:szCs w:val="20"/>
-              </w:rPr>
-              <w:t>guía te lleva paso a paso desde la formación del equipo hasta tener el repositorio listo para comenzar a desarrollar. Completa cada sección durante la sesión de hoy.</w:t>
+              <w:t>Esta guía te lleva paso a paso desde la formación del equipo hasta tener el repositorio listo para comenzar a desarrollar. Completa cada sección durante la sesión de hoy.</w:t>
             </w:r>
           </w:p>
         </w:tc>
@@ -399,10 +389,7 @@
         </w:pBdr>
       </w:pPr>
       <w:r>
-        <w:t>👥</w:t>
-      </w:r>
-      <w:r>
-        <w:t xml:space="preserve">  1 · Formación de Equipos</w:t>
+        <w:t>👥  1 · Formación de Equipos</w:t>
       </w:r>
     </w:p>
     <w:p>
@@ -410,10 +397,7 @@
         <w:spacing w:before="60" w:after="60"/>
       </w:pPr>
       <w:r>
-        <w:t xml:space="preserve">Cada equipo estará compuesto por 2 o 3 </w:t>
-      </w:r>
-      <w:r>
-        <w:t>integrantes. Completa la siguiente ficha con los datos de tu equipo:</w:t>
+        <w:t>Cada equipo estará compuesto por 2 o 3 integrantes. Completa la siguiente ficha con los datos de tu equipo:</w:t>
       </w:r>
     </w:p>
     <w:p>
@@ -971,17 +955,7 @@
                 <w:sz w:val="20"/>
                 <w:szCs w:val="20"/>
               </w:rPr>
-              <w:t xml:space="preserve">Recuerda: aunque el proyecto se trabaja en grupo, la </w:t>
-            </w:r>
-            <w:r>
-              <w:rPr>
-                <w:i/>
-                <w:iCs/>
-                <w:color w:val="1A3A5C"/>
-                <w:sz w:val="20"/>
-                <w:szCs w:val="20"/>
-              </w:rPr>
-              <w:t>DEFENSA ES INDIVIDUAL. Todos deben conocer a fondo cada parte del proyecto.</w:t>
+              <w:t>Recuerda: aunque el proyecto se trabaja en grupo, la DEFENSA ES INDIVIDUAL. Todos deben conocer a fondo cada parte del proyecto.</w:t>
             </w:r>
           </w:p>
         </w:tc>
@@ -1000,10 +974,7 @@
         </w:pBdr>
       </w:pPr>
       <w:r>
-        <w:t>🎯</w:t>
-      </w:r>
-      <w:r>
-        <w:t xml:space="preserve">  2 · Elección del Dominio del Proyecto</w:t>
+        <w:t>🎯  2 · Elección del Dominio del Proyecto</w:t>
       </w:r>
     </w:p>
     <w:p>
@@ -1011,10 +982,7 @@
         <w:spacing w:before="60" w:after="60"/>
       </w:pPr>
       <w:r>
-        <w:t xml:space="preserve">El dominio define el contexto de negocio sobre el cual construirán sus 10 microservicios. Puede ser un dominio propio o uno </w:t>
-      </w:r>
-      <w:r>
-        <w:t>propuesto por el docente.</w:t>
+        <w:t>El dominio define el contexto de negocio sobre el cual construirán sus 10 microservicios. Puede ser un dominio propio o uno propuesto por el docente.</w:t>
       </w:r>
     </w:p>
     <w:p>
@@ -1186,14 +1154,7 @@
                 <w:sz w:val="20"/>
                 <w:szCs w:val="20"/>
               </w:rPr>
-              <w:t>Pacient</w:t>
-            </w:r>
-            <w:r>
-              <w:rPr>
-                <w:sz w:val="20"/>
-                <w:szCs w:val="20"/>
-              </w:rPr>
-              <w:t>es, Médicos, Citas, Recetas, Urgencias, Hospitalizaciones…</w:t>
+              <w:t>Pacientes, Médicos, Citas, Recetas, Urgencias, Hospitalizaciones…</w:t>
             </w:r>
           </w:p>
         </w:tc>
@@ -1334,14 +1295,7 @@
                 <w:sz w:val="20"/>
                 <w:szCs w:val="20"/>
               </w:rPr>
-              <w:t xml:space="preserve">Sistema </w:t>
-            </w:r>
-            <w:r>
-              <w:rPr>
-                <w:sz w:val="20"/>
-                <w:szCs w:val="20"/>
-              </w:rPr>
-              <w:t>universitario</w:t>
+              <w:t>Sistema universitario</w:t>
             </w:r>
           </w:p>
         </w:tc>
@@ -1480,14 +1434,7 @@
                 <w:sz w:val="20"/>
                 <w:szCs w:val="20"/>
               </w:rPr>
-              <w:t xml:space="preserve">Usuarios, Publicaciones, Comentarios, Likes, Seguimientos, </w:t>
-            </w:r>
-            <w:r>
-              <w:rPr>
-                <w:sz w:val="20"/>
-                <w:szCs w:val="20"/>
-              </w:rPr>
-              <w:t>Notificaciones…</w:t>
+              <w:t>Usuarios, Publicaciones, Comentarios, Likes, Seguimientos, Notificaciones…</w:t>
             </w:r>
           </w:p>
         </w:tc>
@@ -1614,12 +1561,15 @@
             </w:tcMar>
           </w:tcPr>
           <w:p>
-            <w:r>
-              <w:rPr>
-                <w:sz w:val="20"/>
-                <w:szCs w:val="20"/>
-              </w:rPr>
-              <w:t xml:space="preserve">                                                                                                              </w:t>
+            <w:pPr>
+              <w:jc w:val="center"/>
+            </w:pPr>
+            <w:r>
+              <w:rPr>
+                <w:sz w:val="20"/>
+                <w:szCs w:val="20"/>
+              </w:rPr>
+              <w:t>MarFuego Colectivo</w:t>
             </w:r>
           </w:p>
         </w:tc>
@@ -1774,7 +1724,11 @@
               <w:right w:w="140" w:type="dxa"/>
             </w:tcMar>
           </w:tcPr>
-          <w:p/>
+          <w:p>
+            <w:r>
+              <w:t>MarFuego Colectivo</w:t>
+            </w:r>
+          </w:p>
         </w:tc>
       </w:tr>
       <w:tr>
@@ -1822,7 +1776,20 @@
               <w:right w:w="140" w:type="dxa"/>
             </w:tcMar>
           </w:tcPr>
-          <w:p/>
+          <w:p>
+            <w:r>
+              <w:t>P</w:t>
+            </w:r>
+            <w:r>
+              <w:t>orque su flujo (locales,</w:t>
+            </w:r>
+            <w:r>
+              <w:t xml:space="preserve"> empleados, inventario, etc</w:t>
+            </w:r>
+            <w:r>
+              <w:t>) es ideal para demostrar cómo se conectan y comunican varios microservicios en un negocio real.</w:t>
+            </w:r>
+          </w:p>
         </w:tc>
       </w:tr>
       <w:tr>
@@ -1849,14 +1816,7 @@
                 <w:sz w:val="20"/>
                 <w:szCs w:val="20"/>
               </w:rPr>
-              <w:t xml:space="preserve">¿Qué </w:t>
-            </w:r>
-            <w:r>
-              <w:rPr>
-                <w:sz w:val="20"/>
-                <w:szCs w:val="20"/>
-              </w:rPr>
-              <w:t>problema resuelve?</w:t>
+              <w:t>¿Qué problema resuelve?</w:t>
             </w:r>
           </w:p>
         </w:tc>
@@ -1877,7 +1837,11 @@
               <w:right w:w="140" w:type="dxa"/>
             </w:tcMar>
           </w:tcPr>
-          <w:p/>
+          <w:p>
+            <w:r>
+              <w:t>Resuelve el problema de controlar la cadena de suministro y los costos en tiempo real.</w:t>
+            </w:r>
+          </w:p>
         </w:tc>
       </w:tr>
       <w:tr>
@@ -1931,7 +1895,70 @@
                 <w:sz w:val="20"/>
                 <w:szCs w:val="20"/>
               </w:rPr>
-              <w:t>1. ___  2. ___  3. ___  4. ___  5. ___</w:t>
+              <w:t xml:space="preserve">1. </w:t>
+            </w:r>
+            <w:r>
+              <w:rPr>
+                <w:sz w:val="20"/>
+                <w:szCs w:val="20"/>
+              </w:rPr>
+              <w:t>Ms-locales</w:t>
+            </w:r>
+            <w:r>
+              <w:rPr>
+                <w:sz w:val="20"/>
+                <w:szCs w:val="20"/>
+              </w:rPr>
+              <w:t xml:space="preserve">  2.</w:t>
+            </w:r>
+            <w:r>
+              <w:rPr>
+                <w:sz w:val="20"/>
+                <w:szCs w:val="20"/>
+              </w:rPr>
+              <w:t xml:space="preserve"> Ms-inventario</w:t>
+            </w:r>
+            <w:r>
+              <w:rPr>
+                <w:sz w:val="20"/>
+                <w:szCs w:val="20"/>
+              </w:rPr>
+              <w:t xml:space="preserve">  3.</w:t>
+            </w:r>
+            <w:r>
+              <w:rPr>
+                <w:sz w:val="20"/>
+                <w:szCs w:val="20"/>
+              </w:rPr>
+              <w:t xml:space="preserve"> Ms-pedido</w:t>
+            </w:r>
+            <w:r>
+              <w:rPr>
+                <w:sz w:val="20"/>
+                <w:szCs w:val="20"/>
+              </w:rPr>
+              <w:t xml:space="preserve">  4. </w:t>
+            </w:r>
+            <w:r>
+              <w:rPr>
+                <w:sz w:val="20"/>
+                <w:szCs w:val="20"/>
+              </w:rPr>
+              <w:t>Ms-plato</w:t>
+            </w:r>
+            <w:r>
+              <w:rPr>
+                <w:sz w:val="20"/>
+                <w:szCs w:val="20"/>
+              </w:rPr>
+              <w:t xml:space="preserve">  5.</w:t>
+            </w:r>
+            <w:r>
+              <w:rPr>
+                <w:sz w:val="20"/>
+                <w:szCs w:val="20"/>
+              </w:rPr>
+              <w:t xml:space="preserve"> Ms-proveedores</w:t>
             </w:r>
           </w:p>
         </w:tc>
@@ -1982,12 +2009,68 @@
             </w:tcMar>
           </w:tcPr>
           <w:p>
-            <w:r>
-              <w:rPr>
-                <w:sz w:val="20"/>
-                <w:szCs w:val="20"/>
-              </w:rPr>
-              <w:t>1. ___  2. ___  3. ___</w:t>
+            <w:pPr>
+              <w:pStyle w:val="Prrafodelista"/>
+              <w:numPr>
+                <w:ilvl w:val="0"/>
+                <w:numId w:val="3"/>
+              </w:numPr>
+            </w:pPr>
+            <w:r>
+              <w:rPr>
+                <w:sz w:val="20"/>
+                <w:szCs w:val="20"/>
+              </w:rPr>
+              <w:t>Aislamiento y Autonomía de Datos</w:t>
+            </w:r>
+            <w:r>
+              <w:rPr>
+                <w:sz w:val="20"/>
+                <w:szCs w:val="20"/>
+              </w:rPr>
+              <w:t xml:space="preserve"> </w:t>
+            </w:r>
+            <w:r>
+              <w:rPr>
+                <w:sz w:val="20"/>
+                <w:szCs w:val="20"/>
+              </w:rPr>
+              <w:t>2.</w:t>
+            </w:r>
+            <w:r>
+              <w:rPr>
+                <w:sz w:val="20"/>
+                <w:szCs w:val="20"/>
+              </w:rPr>
+              <w:t xml:space="preserve"> </w:t>
+            </w:r>
+            <w:r>
+              <w:rPr>
+                <w:sz w:val="20"/>
+                <w:szCs w:val="20"/>
+              </w:rPr>
+              <w:t>Guardado e Integridad de Datos</w:t>
+            </w:r>
+            <w:r>
+              <w:rPr>
+                <w:sz w:val="20"/>
+                <w:szCs w:val="20"/>
+              </w:rPr>
+              <w:t xml:space="preserve">   3. </w:t>
+            </w:r>
+            <w:r>
+              <w:rPr>
+                <w:sz w:val="20"/>
+                <w:szCs w:val="20"/>
+              </w:rPr>
+              <w:t xml:space="preserve"> </w:t>
+            </w:r>
+            <w:r>
+              <w:rPr>
+                <w:sz w:val="20"/>
+                <w:szCs w:val="20"/>
+              </w:rPr>
+              <w:t>Conectividad e Intercambio de Información</w:t>
             </w:r>
           </w:p>
         </w:tc>
@@ -2085,17 +2168,7 @@
                 <w:sz w:val="20"/>
                 <w:szCs w:val="20"/>
               </w:rPr>
-              <w:t xml:space="preserve">, siempre que la </w:t>
-            </w:r>
-            <w:r>
-              <w:rPr>
-                <w:i/>
-                <w:iCs/>
-                <w:color w:val="1A3A5C"/>
-                <w:sz w:val="20"/>
-                <w:szCs w:val="20"/>
-              </w:rPr>
-              <w:t>arquitectura sea coherente, cohesiva y con separación funcional clara.</w:t>
+              <w:t>, siempre que la arquitectura sea coherente, cohesiva y con separación funcional clara.</w:t>
             </w:r>
           </w:p>
         </w:tc>
@@ -2144,11 +2217,7 @@
         </w:pBdr>
       </w:pPr>
       <w:r>
-        <w:lastRenderedPageBreak/>
-        <w:t>🧩</w:t>
-      </w:r>
-      <w:r>
-        <w:t xml:space="preserve">  3 · Identificación de Microservicios</w:t>
+        <w:t>🧩  3 · Identificación de Microservicios</w:t>
       </w:r>
     </w:p>
     <w:p>
@@ -2156,10 +2225,7 @@
         <w:spacing w:before="60" w:after="60"/>
       </w:pPr>
       <w:r>
-        <w:t xml:space="preserve">Lista los microservicios que planean implementar. Recuerden que cada uno debe tener su propia base de datos y cumplir con el patrón CSR </w:t>
-      </w:r>
-      <w:r>
-        <w:t>(Controller – Service – Repository).</w:t>
+        <w:t>Lista los microservicios que planean implementar. Recuerden que cada uno debe tener su propia base de datos y cumplir con el patrón CSR (Controller – Service – Repository).</w:t>
       </w:r>
     </w:p>
     <w:p>
@@ -2373,7 +2439,11 @@
               <w:right w:w="140" w:type="dxa"/>
             </w:tcMar>
           </w:tcPr>
-          <w:p/>
+          <w:p>
+            <w:r>
+              <w:t xml:space="preserve">Ms-locales </w:t>
+            </w:r>
+          </w:p>
         </w:tc>
         <w:tc>
           <w:tcPr>
@@ -2392,7 +2462,11 @@
               <w:right w:w="140" w:type="dxa"/>
             </w:tcMar>
           </w:tcPr>
-          <w:p/>
+          <w:p>
+            <w:r>
+              <w:t>Gestionar la información de las sucursales físicas, aforos y la disponibilidad de sus mesas de atención.</w:t>
+            </w:r>
+          </w:p>
         </w:tc>
         <w:tc>
           <w:tcPr>
@@ -2411,7 +2485,11 @@
               <w:right w:w="140" w:type="dxa"/>
             </w:tcMar>
           </w:tcPr>
-          <w:p/>
+          <w:p>
+            <w:r>
+              <w:t>Locales</w:t>
+            </w:r>
+          </w:p>
         </w:tc>
       </w:tr>
       <w:tr>
@@ -2459,7 +2537,11 @@
               <w:right w:w="140" w:type="dxa"/>
             </w:tcMar>
           </w:tcPr>
-          <w:p/>
+          <w:p>
+            <w:r>
+              <w:t>Ms-producto</w:t>
+            </w:r>
+          </w:p>
         </w:tc>
         <w:tc>
           <w:tcPr>
@@ -2478,7 +2560,11 @@
               <w:right w:w="140" w:type="dxa"/>
             </w:tcMar>
           </w:tcPr>
-          <w:p/>
+          <w:p>
+            <w:r>
+              <w:t>Administrar el catálogo general de materias primas e insumos individuales recibidos en el colectivo.</w:t>
+            </w:r>
+          </w:p>
         </w:tc>
         <w:tc>
           <w:tcPr>
@@ -2497,7 +2583,11 @@
               <w:right w:w="140" w:type="dxa"/>
             </w:tcMar>
           </w:tcPr>
-          <w:p/>
+          <w:p>
+            <w:r>
+              <w:t>Producto</w:t>
+            </w:r>
+          </w:p>
         </w:tc>
       </w:tr>
       <w:tr>
@@ -2545,7 +2635,11 @@
               <w:right w:w="140" w:type="dxa"/>
             </w:tcMar>
           </w:tcPr>
-          <w:p/>
+          <w:p>
+            <w:r>
+              <w:t>Ms-empleados</w:t>
+            </w:r>
+          </w:p>
         </w:tc>
         <w:tc>
           <w:tcPr>
@@ -2564,7 +2658,11 @@
               <w:right w:w="140" w:type="dxa"/>
             </w:tcMar>
           </w:tcPr>
-          <w:p/>
+          <w:p>
+            <w:r>
+              <w:t>Controlar el registro del personal, sus cargos operativos y su asignación obligatoria a una sucursal.</w:t>
+            </w:r>
+          </w:p>
         </w:tc>
         <w:tc>
           <w:tcPr>
@@ -2583,7 +2681,11 @@
               <w:right w:w="140" w:type="dxa"/>
             </w:tcMar>
           </w:tcPr>
-          <w:p/>
+          <w:p>
+            <w:r>
+              <w:t>Empleados</w:t>
+            </w:r>
+          </w:p>
         </w:tc>
       </w:tr>
       <w:tr>
@@ -2631,7 +2733,11 @@
               <w:right w:w="140" w:type="dxa"/>
             </w:tcMar>
           </w:tcPr>
-          <w:p/>
+          <w:p>
+            <w:r>
+              <w:t>Ms-proveedores</w:t>
+            </w:r>
+          </w:p>
         </w:tc>
         <w:tc>
           <w:tcPr>
@@ -2650,7 +2756,11 @@
               <w:right w:w="140" w:type="dxa"/>
             </w:tcMar>
           </w:tcPr>
-          <w:p/>
+          <w:p>
+            <w:r>
+              <w:t>Gestionar el directorio de pescadores, agricultores y entidades de abasto, controlando su ubicación y estado.</w:t>
+            </w:r>
+          </w:p>
         </w:tc>
         <w:tc>
           <w:tcPr>
@@ -2669,7 +2779,11 @@
               <w:right w:w="140" w:type="dxa"/>
             </w:tcMar>
           </w:tcPr>
-          <w:p/>
+          <w:p>
+            <w:r>
+              <w:t>Proveedores</w:t>
+            </w:r>
+          </w:p>
         </w:tc>
       </w:tr>
       <w:tr>
@@ -2717,7 +2831,14 @@
               <w:right w:w="140" w:type="dxa"/>
             </w:tcMar>
           </w:tcPr>
-          <w:p/>
+          <w:p>
+            <w:r>
+              <w:t>Ms-</w:t>
+            </w:r>
+            <w:r>
+              <w:t>Inventario</w:t>
+            </w:r>
+          </w:p>
         </w:tc>
         <w:tc>
           <w:tcPr>
@@ -2736,7 +2857,11 @@
               <w:right w:w="140" w:type="dxa"/>
             </w:tcMar>
           </w:tcPr>
-          <w:p/>
+          <w:p>
+            <w:r>
+              <w:t>Monitorear el stock en tiempo real de cada local físico y controlar las alertas automáticas de reabastecimiento.</w:t>
+            </w:r>
+          </w:p>
         </w:tc>
         <w:tc>
           <w:tcPr>
@@ -2755,7 +2880,11 @@
               <w:right w:w="140" w:type="dxa"/>
             </w:tcMar>
           </w:tcPr>
-          <w:p/>
+          <w:p>
+            <w:r>
+              <w:t>Inventario</w:t>
+            </w:r>
+          </w:p>
         </w:tc>
       </w:tr>
       <w:tr>
@@ -2803,7 +2932,11 @@
               <w:right w:w="140" w:type="dxa"/>
             </w:tcMar>
           </w:tcPr>
-          <w:p/>
+          <w:p>
+            <w:r>
+              <w:t>Ms-Plato</w:t>
+            </w:r>
+          </w:p>
         </w:tc>
         <w:tc>
           <w:tcPr>
@@ -2822,7 +2955,11 @@
               <w:right w:w="140" w:type="dxa"/>
             </w:tcMar>
           </w:tcPr>
-          <w:p/>
+          <w:p>
+            <w:r>
+              <w:t>Estructurar las recetas del menú mediante la asociación y el costeo dinámico de los productos base utilizados.</w:t>
+            </w:r>
+          </w:p>
         </w:tc>
         <w:tc>
           <w:tcPr>
@@ -2841,7 +2978,11 @@
               <w:right w:w="140" w:type="dxa"/>
             </w:tcMar>
           </w:tcPr>
-          <w:p/>
+          <w:p>
+            <w:r>
+              <w:t>Plato</w:t>
+            </w:r>
+          </w:p>
         </w:tc>
       </w:tr>
       <w:tr>
@@ -2889,7 +3030,11 @@
               <w:right w:w="140" w:type="dxa"/>
             </w:tcMar>
           </w:tcPr>
-          <w:p/>
+          <w:p>
+            <w:r>
+              <w:t>Ms-Pedido</w:t>
+            </w:r>
+          </w:p>
         </w:tc>
         <w:tc>
           <w:tcPr>
@@ -2908,7 +3053,11 @@
               <w:right w:w="140" w:type="dxa"/>
             </w:tcMar>
           </w:tcPr>
-          <w:p/>
+          <w:p>
+            <w:r>
+              <w:t>Procesar las comandas de los clientes en mesa y coordinar las solicitudes de compra generadas hacia los proveedores.</w:t>
+            </w:r>
+          </w:p>
         </w:tc>
         <w:tc>
           <w:tcPr>
@@ -2927,7 +3076,11 @@
               <w:right w:w="140" w:type="dxa"/>
             </w:tcMar>
           </w:tcPr>
-          <w:p/>
+          <w:p>
+            <w:r>
+              <w:t>Pedido</w:t>
+            </w:r>
+          </w:p>
         </w:tc>
       </w:tr>
       <w:tr>
@@ -3202,10 +3355,8 @@
         </w:pBdr>
       </w:pPr>
       <w:r>
-        <w:t>🐙</w:t>
-      </w:r>
-      <w:r>
-        <w:t xml:space="preserve">  4 · Creación del Repositorio GitHub</w:t>
+        <w:lastRenderedPageBreak/>
+        <w:t>🐙  4 · Creación del Repositorio GitHub</w:t>
       </w:r>
     </w:p>
     <w:p>
@@ -3213,10 +3364,7 @@
         <w:spacing w:before="60" w:after="60"/>
       </w:pPr>
       <w:r>
-        <w:t xml:space="preserve">El repositorio debe estar creado y </w:t>
-      </w:r>
-      <w:r>
-        <w:t>configurado antes de terminar esta sesión. Sigan los pasos a continuación:</w:t>
+        <w:t>El repositorio debe estar creado y configurado antes de terminar esta sesión. Sigan los pasos a continuación:</w:t>
       </w:r>
     </w:p>
     <w:p>
@@ -3380,17 +3528,7 @@
                 <w:sz w:val="20"/>
                 <w:szCs w:val="20"/>
               </w:rPr>
-              <w:t xml:space="preserve">Valor </w:t>
-            </w:r>
-            <w:r>
-              <w:rPr>
-                <w:b/>
-                <w:bCs/>
-                <w:color w:val="FFFFFF"/>
-                <w:sz w:val="20"/>
-                <w:szCs w:val="20"/>
-              </w:rPr>
-              <w:t>recomendado</w:t>
+              <w:t>Valor recomendado</w:t>
             </w:r>
           </w:p>
         </w:tc>
@@ -3688,14 +3826,7 @@
                 <w:sz w:val="20"/>
                 <w:szCs w:val="20"/>
               </w:rPr>
-              <w:t>.</w:t>
-            </w:r>
-            <w:r>
-              <w:rPr>
-                <w:sz w:val="20"/>
-                <w:szCs w:val="20"/>
-              </w:rPr>
-              <w:t>gitignore</w:t>
+              <w:t>.gitignore</w:t>
             </w:r>
           </w:p>
         </w:tc>
@@ -3763,7 +3894,6 @@
         <w:pStyle w:val="Ttulo3"/>
       </w:pPr>
       <w:r>
-        <w:lastRenderedPageBreak/>
         <w:t>Paso 2 — Agregar colaboradores al repositorio</w:t>
       </w:r>
       <w:r>
@@ -3775,10 +3905,7 @@
         <w:spacing w:before="60" w:after="60"/>
       </w:pPr>
       <w:r>
-        <w:t>Ve a Settings &gt; Collaborators &gt; Add people y agrega a todos los integrantes del equipo y al docen</w:t>
-      </w:r>
-      <w:r>
-        <w:t>te.</w:t>
+        <w:t>Ve a Settings &gt; Collaborators &gt; Add people y agrega a todos los integrantes del equipo y al docente.</w:t>
       </w:r>
     </w:p>
     <w:p>
@@ -4312,17 +4439,7 @@
                 <w:sz w:val="20"/>
                 <w:szCs w:val="20"/>
               </w:rPr>
-              <w:t>Ruta exacta: github.com/[tu-usuario]/[nombre-repo] → Settings → Collaborators → Add people</w:t>
-            </w:r>
-            <w:r>
-              <w:rPr>
-                <w:i/>
-                <w:iCs/>
-                <w:color w:val="1A3A5C"/>
-                <w:sz w:val="20"/>
-                <w:szCs w:val="20"/>
-              </w:rPr>
-              <w:t xml:space="preserve"> → buscar por nombre de usuario o email.</w:t>
+              <w:t>Ruta exacta: github.com/[tu-usuario]/[nombre-repo] → Settings → Collaborators → Add people → buscar por nombre de usuario o email.</w:t>
             </w:r>
           </w:p>
         </w:tc>
@@ -4445,6 +4562,7 @@
                 <w:sz w:val="18"/>
                 <w:szCs w:val="18"/>
               </w:rPr>
+              <w:lastRenderedPageBreak/>
               <w:t>[Descripción breve del dominio y el problema que resuelve]</w:t>
             </w:r>
           </w:p>
@@ -4534,8 +4652,18 @@
                 <w:sz w:val="18"/>
                 <w:szCs w:val="18"/>
               </w:rPr>
-              <w:t xml:space="preserve">| </w:t>
-            </w:r>
+              <w:t>| Integrante 3 | @usuario3 |</w:t>
+            </w:r>
+          </w:p>
+          <w:p>
+            <w:pPr>
+              <w:spacing w:before="20" w:after="20"/>
+            </w:pPr>
+          </w:p>
+          <w:p>
+            <w:pPr>
+              <w:spacing w:before="20" w:after="20"/>
+            </w:pPr>
             <w:r>
               <w:rPr>
                 <w:rFonts w:ascii="Courier New" w:eastAsia="Courier New" w:hAnsi="Courier New" w:cs="Courier New"/>
@@ -4543,13 +4671,8 @@
                 <w:sz w:val="18"/>
                 <w:szCs w:val="18"/>
               </w:rPr>
-              <w:t>Integrante 3 | @usuario3 |</w:t>
-            </w:r>
-          </w:p>
-          <w:p>
-            <w:pPr>
-              <w:spacing w:before="20" w:after="20"/>
-            </w:pPr>
+              <w:t>## Microservicios Implementados</w:t>
+            </w:r>
           </w:p>
           <w:p>
             <w:pPr>
@@ -4562,7 +4685,7 @@
                 <w:sz w:val="18"/>
                 <w:szCs w:val="18"/>
               </w:rPr>
-              <w:t>## Microservicios Implementados</w:t>
+              <w:t>| # | Microservicio | Puerto | Descripción |</w:t>
             </w:r>
           </w:p>
           <w:p>
@@ -4576,7 +4699,7 @@
                 <w:sz w:val="18"/>
                 <w:szCs w:val="18"/>
               </w:rPr>
-              <w:t>| # | Microservicio | Puerto | Descripción |</w:t>
+              <w:t>|---|---------------|--------|-------------|</w:t>
             </w:r>
           </w:p>
           <w:p>
@@ -4590,7 +4713,7 @@
                 <w:sz w:val="18"/>
                 <w:szCs w:val="18"/>
               </w:rPr>
-              <w:t>|---|---------------|--------|-------------|</w:t>
+              <w:t>| 1 | ms-[nombre]   | 8081   | ...         |</w:t>
             </w:r>
           </w:p>
           <w:p>
@@ -4604,8 +4727,13 @@
                 <w:sz w:val="18"/>
                 <w:szCs w:val="18"/>
               </w:rPr>
-              <w:t>| 1 | ms-[nombre]   | 8081   | ...         |</w:t>
-            </w:r>
+              <w:t>| 2 | ms-[nombre]   | 8082   | ...         |</w:t>
+            </w:r>
+          </w:p>
+          <w:p>
+            <w:pPr>
+              <w:spacing w:before="20" w:after="20"/>
+            </w:pPr>
           </w:p>
           <w:p>
             <w:pPr>
@@ -4618,35 +4746,7 @@
                 <w:sz w:val="18"/>
                 <w:szCs w:val="18"/>
               </w:rPr>
-              <w:t>| 2 | ms-[nombre]   | 8082   | ...         |</w:t>
-            </w:r>
-          </w:p>
-          <w:p>
-            <w:pPr>
-              <w:spacing w:before="20" w:after="20"/>
-            </w:pPr>
-          </w:p>
-          <w:p>
-            <w:pPr>
-              <w:spacing w:before="20" w:after="20"/>
-            </w:pPr>
-            <w:r>
-              <w:rPr>
-                <w:rFonts w:ascii="Courier New" w:eastAsia="Courier New" w:hAnsi="Courier New" w:cs="Courier New"/>
-                <w:color w:val="D4D4D4"/>
-                <w:sz w:val="18"/>
-                <w:szCs w:val="18"/>
-              </w:rPr>
-              <w:t xml:space="preserve">## Tecnologías </w:t>
-            </w:r>
-            <w:r>
-              <w:rPr>
-                <w:rFonts w:ascii="Courier New" w:eastAsia="Courier New" w:hAnsi="Courier New" w:cs="Courier New"/>
-                <w:color w:val="D4D4D4"/>
-                <w:sz w:val="18"/>
-                <w:szCs w:val="18"/>
-              </w:rPr>
-              <w:t>Utilizadas</w:t>
+              <w:t>## Tecnologías Utilizadas</w:t>
             </w:r>
           </w:p>
           <w:p>
@@ -4829,16 +4929,7 @@
                 <w:sz w:val="18"/>
                 <w:szCs w:val="18"/>
               </w:rPr>
-              <w:t>🔄</w:t>
-            </w:r>
-            <w:r>
-              <w:rPr>
-                <w:rFonts w:ascii="Courier New" w:eastAsia="Courier New" w:hAnsi="Courier New" w:cs="Courier New"/>
-                <w:color w:val="D4D4D4"/>
-                <w:sz w:val="18"/>
-                <w:szCs w:val="18"/>
-              </w:rPr>
-              <w:t xml:space="preserve"> En desarrollo — EP2 2025</w:t>
+              <w:t>🔄 En desarrollo — EP2 2025</w:t>
             </w:r>
           </w:p>
         </w:tc>
@@ -4909,10 +5000,7 @@
         <w:pStyle w:val="Ttulo3"/>
       </w:pPr>
       <w:r>
-        <w:t xml:space="preserve">Paso 4 </w:t>
-      </w:r>
-      <w:r>
-        <w:t>— Clonar el repositorio en local</w:t>
+        <w:t>Paso 4 — Clonar el repositorio en local</w:t>
       </w:r>
     </w:p>
     <w:p>
@@ -5057,16 +5145,7 @@
                 <w:sz w:val="18"/>
                 <w:szCs w:val="18"/>
               </w:rPr>
-              <w:t xml:space="preserve">git </w:t>
-            </w:r>
-            <w:r>
-              <w:rPr>
-                <w:rFonts w:ascii="Courier New" w:eastAsia="Courier New" w:hAnsi="Courier New" w:cs="Courier New"/>
-                <w:color w:val="D4D4D4"/>
-                <w:sz w:val="18"/>
-                <w:szCs w:val="18"/>
-              </w:rPr>
-              <w:t>status</w:t>
+              <w:t>git status</w:t>
             </w:r>
           </w:p>
         </w:tc>
@@ -5085,10 +5164,7 @@
         </w:pBdr>
       </w:pPr>
       <w:r>
-        <w:t>📝</w:t>
-      </w:r>
-      <w:r>
-        <w:t xml:space="preserve">  5 · Convenciones de Git para el Equipo</w:t>
+        <w:t>📝  5 · Convenciones de Git para el Equipo</w:t>
       </w:r>
     </w:p>
     <w:p>
@@ -5254,6 +5330,7 @@
                 <w:sz w:val="20"/>
                 <w:szCs w:val="20"/>
               </w:rPr>
+              <w:lastRenderedPageBreak/>
               <w:t>feat:</w:t>
             </w:r>
           </w:p>
@@ -5281,14 +5358,7 @@
                 <w:sz w:val="20"/>
                 <w:szCs w:val="20"/>
               </w:rPr>
-              <w:t xml:space="preserve">Nueva </w:t>
-            </w:r>
-            <w:r>
-              <w:rPr>
-                <w:sz w:val="20"/>
-                <w:szCs w:val="20"/>
-              </w:rPr>
-              <w:t>funcionalidad</w:t>
+              <w:t>Nueva funcionalidad</w:t>
             </w:r>
           </w:p>
         </w:tc>
@@ -5555,14 +5625,7 @@
                 <w:sz w:val="20"/>
                 <w:szCs w:val="20"/>
               </w:rPr>
-              <w:t xml:space="preserve">Mejora de código sin cambiar </w:t>
-            </w:r>
-            <w:r>
-              <w:rPr>
-                <w:sz w:val="20"/>
-                <w:szCs w:val="20"/>
-              </w:rPr>
-              <w:t>funcionalidad</w:t>
+              <w:t>Mejora de código sin cambiar funcionalidad</w:t>
             </w:r>
           </w:p>
         </w:tc>
@@ -5834,62 +5897,12 @@
                 <w:sz w:val="20"/>
                 <w:szCs w:val="20"/>
               </w:rPr>
-              <w:t xml:space="preserve">IMPORTANTE: Cualquier cambio en el </w:t>
-            </w:r>
-            <w:r>
-              <w:rPr>
-                <w:i/>
-                <w:iCs/>
-                <w:color w:val="1A3A5C"/>
-                <w:sz w:val="20"/>
-                <w:szCs w:val="20"/>
-              </w:rPr>
-              <w:t>repositorio detectado DESPUÉS de la fecha de entrega (semana 10) y ANTES de la evaluación resultará en nota 1.0 automática para todo el equipo.</w:t>
+              <w:t>IMPORTANTE: Cualquier cambio en el repositorio detectado DESPUÉS de la fecha de entrega (semana 10) y ANTES de la evaluación resultará en nota 1.0 automática para todo el equipo.</w:t>
             </w:r>
           </w:p>
         </w:tc>
       </w:tr>
     </w:tbl>
-    <w:p>
-      <w:pPr>
-        <w:spacing w:before="80" w:after="80"/>
-      </w:pPr>
-    </w:p>
-    <w:p>
-      <w:pPr>
-        <w:spacing w:before="80" w:after="80"/>
-      </w:pPr>
-    </w:p>
-    <w:p>
-      <w:pPr>
-        <w:spacing w:before="80" w:after="80"/>
-      </w:pPr>
-    </w:p>
-    <w:p>
-      <w:pPr>
-        <w:spacing w:before="80" w:after="80"/>
-      </w:pPr>
-    </w:p>
-    <w:p>
-      <w:pPr>
-        <w:spacing w:before="80" w:after="80"/>
-      </w:pPr>
-    </w:p>
-    <w:p>
-      <w:pPr>
-        <w:spacing w:before="80" w:after="80"/>
-      </w:pPr>
-    </w:p>
-    <w:p>
-      <w:pPr>
-        <w:spacing w:before="80" w:after="80"/>
-      </w:pPr>
-    </w:p>
-    <w:p>
-      <w:pPr>
-        <w:spacing w:before="80" w:after="80"/>
-      </w:pPr>
-    </w:p>
     <w:p>
       <w:pPr>
         <w:spacing w:before="80" w:after="80"/>
@@ -5903,11 +5916,7 @@
         </w:pBdr>
       </w:pPr>
       <w:r>
-        <w:lastRenderedPageBreak/>
-        <w:t>📋</w:t>
-      </w:r>
-      <w:r>
-        <w:t xml:space="preserve">  6 · Planificación con </w:t>
+        <w:t xml:space="preserve">📋  6 · Planificación con </w:t>
       </w:r>
       <w:r>
         <w:t>Jira o ClickUp</w:t>
@@ -5921,10 +5930,7 @@
         <w:spacing w:before="60" w:after="60"/>
       </w:pPr>
       <w:r>
-        <w:t xml:space="preserve">La rúbrica evalúa el uso de herramientas </w:t>
-      </w:r>
-      <w:r>
-        <w:t>colaborativas. Creen un tablero en Trello (trello.com) con la siguiente estructura básica:</w:t>
+        <w:t>La rúbrica evalúa el uso de herramientas colaborativas. Creen un tablero en Trello (trello.com) con la siguiente estructura básica:</w:t>
       </w:r>
     </w:p>
     <w:p>
@@ -6047,14 +6053,7 @@
                 <w:sz w:val="20"/>
                 <w:szCs w:val="20"/>
               </w:rPr>
-              <w:t>📌</w:t>
-            </w:r>
-            <w:r>
-              <w:rPr>
-                <w:sz w:val="20"/>
-                <w:szCs w:val="20"/>
-              </w:rPr>
-              <w:t xml:space="preserve"> Backlog</w:t>
+              <w:t>📌 Backlog</w:t>
             </w:r>
           </w:p>
         </w:tc>
@@ -6110,14 +6109,7 @@
                 <w:sz w:val="20"/>
                 <w:szCs w:val="20"/>
               </w:rPr>
-              <w:t>🔄</w:t>
-            </w:r>
-            <w:r>
-              <w:rPr>
-                <w:sz w:val="20"/>
-                <w:szCs w:val="20"/>
-              </w:rPr>
-              <w:t xml:space="preserve"> En Progreso</w:t>
+              <w:t>🔄 En Progreso</w:t>
             </w:r>
           </w:p>
         </w:tc>
@@ -6173,14 +6165,7 @@
                 <w:sz w:val="20"/>
                 <w:szCs w:val="20"/>
               </w:rPr>
-              <w:t>👀</w:t>
-            </w:r>
-            <w:r>
-              <w:rPr>
-                <w:sz w:val="20"/>
-                <w:szCs w:val="20"/>
-              </w:rPr>
-              <w:t xml:space="preserve"> En Revisión</w:t>
+              <w:t>👀 En Revisión</w:t>
             </w:r>
           </w:p>
         </w:tc>
@@ -6207,14 +6192,7 @@
                 <w:sz w:val="20"/>
                 <w:szCs w:val="20"/>
               </w:rPr>
-              <w:t xml:space="preserve">Tareas </w:t>
-            </w:r>
-            <w:r>
-              <w:rPr>
-                <w:sz w:val="20"/>
-                <w:szCs w:val="20"/>
-              </w:rPr>
-              <w:t>terminadas esperando revisión del compañero</w:t>
+              <w:t>Tareas terminadas esperando revisión del compañero</w:t>
             </w:r>
           </w:p>
         </w:tc>
@@ -6243,14 +6221,7 @@
                 <w:sz w:val="20"/>
                 <w:szCs w:val="20"/>
               </w:rPr>
-              <w:t>✅</w:t>
-            </w:r>
-            <w:r>
-              <w:rPr>
-                <w:sz w:val="20"/>
-                <w:szCs w:val="20"/>
-              </w:rPr>
-              <w:t xml:space="preserve"> Completado</w:t>
+              <w:t>✅ Completado</w:t>
             </w:r>
           </w:p>
         </w:tc>
@@ -6294,6 +6265,86 @@
       </w:pPr>
       <w:r>
         <w:t>Cada tarjeta debe tener: nombre de la tarea, responsable asignado, fecha límite estimada y etiqueta del microservicio al que pertenece.</w:t>
+      </w:r>
+    </w:p>
+    <w:p>
+      <w:pPr>
+        <w:spacing w:before="60" w:after="60"/>
+      </w:pPr>
+    </w:p>
+    <w:p>
+      <w:pPr>
+        <w:spacing w:before="60" w:after="60"/>
+      </w:pPr>
+      <w:r>
+        <w:t>Como equipo nos organizamos por Discord mediante llamadas en vivo y pantallas compartidas. En vez de usar tableros, preferimos juntarnos a planificar las tareas pendientes, revisar los avances del código en tiempo real y coordinar juntos la integración de los microservicios en GitHub. Esta dinámica nos ayudó a resolver problemas de inmediato y a asegurar que todos sepamos cómo funciona cada parte del proyecto.</w:t>
+      </w:r>
+    </w:p>
+    <w:p>
+      <w:pPr>
+        <w:spacing w:before="60" w:after="60"/>
+      </w:pPr>
+      <w:r>
+        <w:t xml:space="preserve">Adjunto screenshot de una de nuestras llamadas: </w:t>
+      </w:r>
+    </w:p>
+    <w:p>
+      <w:pPr>
+        <w:spacing w:before="60" w:after="60"/>
+      </w:pPr>
+      <w:r>
+        <w:rPr>
+          <w:noProof/>
+        </w:rPr>
+        <w:lastRenderedPageBreak/>
+        <w:drawing>
+          <wp:inline distT="0" distB="0" distL="0" distR="0" wp14:anchorId="268AAB82" wp14:editId="7DC6055A">
+            <wp:extent cx="6029325" cy="3248025"/>
+            <wp:effectExtent l="0" t="0" r="9525" b="9525"/>
+            <wp:docPr id="1974045266" name="Imagen 1"/>
+            <wp:cNvGraphicFramePr>
+              <a:graphicFrameLocks xmlns:a="http://schemas.openxmlformats.org/drawingml/2006/main" noChangeAspect="1"/>
+            </wp:cNvGraphicFramePr>
+            <a:graphic xmlns:a="http://schemas.openxmlformats.org/drawingml/2006/main">
+              <a:graphicData uri="http://schemas.openxmlformats.org/drawingml/2006/picture">
+                <pic:pic xmlns:pic="http://schemas.openxmlformats.org/drawingml/2006/picture">
+                  <pic:nvPicPr>
+                    <pic:cNvPr id="0" name="Picture 1"/>
+                    <pic:cNvPicPr>
+                      <a:picLocks noChangeAspect="1" noChangeArrowheads="1"/>
+                    </pic:cNvPicPr>
+                  </pic:nvPicPr>
+                  <pic:blipFill>
+                    <a:blip r:embed="rId5" cstate="print">
+                      <a:extLst>
+                        <a:ext uri="{28A0092B-C50C-407E-A947-70E740481C1C}">
+                          <a14:useLocalDpi xmlns:a14="http://schemas.microsoft.com/office/drawing/2010/main" val="0"/>
+                        </a:ext>
+                      </a:extLst>
+                    </a:blip>
+                    <a:srcRect/>
+                    <a:stretch>
+                      <a:fillRect/>
+                    </a:stretch>
+                  </pic:blipFill>
+                  <pic:spPr bwMode="auto">
+                    <a:xfrm>
+                      <a:off x="0" y="0"/>
+                      <a:ext cx="6029325" cy="3248025"/>
+                    </a:xfrm>
+                    <a:prstGeom prst="rect">
+                      <a:avLst/>
+                    </a:prstGeom>
+                    <a:noFill/>
+                    <a:ln>
+                      <a:noFill/>
+                    </a:ln>
+                  </pic:spPr>
+                </pic:pic>
+              </a:graphicData>
+            </a:graphic>
+          </wp:inline>
+        </w:drawing>
       </w:r>
     </w:p>
     <w:p>
@@ -6381,7 +6432,21 @@
                 <w:sz w:val="20"/>
                 <w:szCs w:val="20"/>
               </w:rPr>
-              <w:t xml:space="preserve">                                                                                                              </w:t>
+              <w:t xml:space="preserve">                                                                             </w:t>
+            </w:r>
+            <w:r>
+              <w:rPr>
+                <w:sz w:val="20"/>
+                <w:szCs w:val="20"/>
+              </w:rPr>
+              <w:t>Discord</w:t>
+            </w:r>
+            <w:r>
+              <w:rPr>
+                <w:sz w:val="20"/>
+                <w:szCs w:val="20"/>
+              </w:rPr>
+              <w:t xml:space="preserve">                                 </w:t>
             </w:r>
           </w:p>
         </w:tc>
@@ -6400,10 +6465,7 @@
         </w:pBdr>
       </w:pPr>
       <w:r>
-        <w:t>✅</w:t>
-      </w:r>
-      <w:r>
-        <w:t xml:space="preserve">  7 · Checklist de Fin de Sesión</w:t>
+        <w:t>✅  7 · Checklist de Fin de Sesión</w:t>
       </w:r>
     </w:p>
     <w:p>
@@ -6411,10 +6473,7 @@
         <w:spacing w:before="60" w:after="60"/>
       </w:pPr>
       <w:r>
-        <w:t xml:space="preserve">Antes de terminar la clase de hoy, verifiquen que todo lo </w:t>
-      </w:r>
-      <w:r>
-        <w:t>siguiente esté completado:</w:t>
+        <w:t>Antes de terminar la clase de hoy, verifiquen que todo lo siguiente esté completado:</w:t>
       </w:r>
     </w:p>
     <w:p>
@@ -6626,14 +6685,7 @@
                 <w:sz w:val="20"/>
                 <w:szCs w:val="20"/>
               </w:rPr>
-              <w:t>☐</w:t>
-            </w:r>
-            <w:r>
-              <w:rPr>
-                <w:sz w:val="20"/>
-                <w:szCs w:val="20"/>
-              </w:rPr>
-              <w:t xml:space="preserve"> Pendiente  </w:t>
+              <w:t xml:space="preserve">☐ Pendiente  </w:t>
             </w:r>
             <w:r>
               <w:rPr>
@@ -6731,14 +6783,22 @@
                 <w:sz w:val="20"/>
                 <w:szCs w:val="20"/>
               </w:rPr>
-              <w:t>☐</w:t>
-            </w:r>
-            <w:r>
-              <w:rPr>
-                <w:sz w:val="20"/>
-                <w:szCs w:val="20"/>
-              </w:rPr>
-              <w:t xml:space="preserve"> Pendiente  ☐ Listo</w:t>
+              <w:t xml:space="preserve">☐ Pendiente  </w:t>
+            </w:r>
+            <w:r>
+              <w:rPr>
+                <w:rFonts w:ascii="Segoe UI Emoji" w:hAnsi="Segoe UI Emoji" w:cs="Segoe UI Emoji"/>
+                <w:sz w:val="20"/>
+                <w:szCs w:val="20"/>
+              </w:rPr>
+              <w:t>✅</w:t>
+            </w:r>
+            <w:r>
+              <w:rPr>
+                <w:sz w:val="20"/>
+                <w:szCs w:val="20"/>
+              </w:rPr>
+              <w:t xml:space="preserve"> Listo</w:t>
             </w:r>
           </w:p>
         </w:tc>
@@ -6767,14 +6827,7 @@
                 <w:sz w:val="20"/>
                 <w:szCs w:val="20"/>
               </w:rPr>
-              <w:t xml:space="preserve">Lista de al menos 10 </w:t>
-            </w:r>
-            <w:r>
-              <w:rPr>
-                <w:sz w:val="20"/>
-                <w:szCs w:val="20"/>
-              </w:rPr>
-              <w:t>microservicios definida</w:t>
+              <w:t>Lista de al menos 10 microservicios definida</w:t>
             </w:r>
           </w:p>
         </w:tc>
@@ -6828,14 +6881,7 @@
                 <w:sz w:val="20"/>
                 <w:szCs w:val="20"/>
               </w:rPr>
-              <w:t>☐</w:t>
-            </w:r>
-            <w:r>
-              <w:rPr>
-                <w:sz w:val="20"/>
-                <w:szCs w:val="20"/>
-              </w:rPr>
-              <w:t xml:space="preserve"> Pendiente  ☐ Listo</w:t>
+              <w:t>☐ Pendiente  ☐ Listo</w:t>
             </w:r>
           </w:p>
         </w:tc>
@@ -6918,14 +6964,7 @@
                 <w:sz w:val="20"/>
                 <w:szCs w:val="20"/>
               </w:rPr>
-              <w:t>☐</w:t>
-            </w:r>
-            <w:r>
-              <w:rPr>
-                <w:sz w:val="20"/>
-                <w:szCs w:val="20"/>
-              </w:rPr>
-              <w:t xml:space="preserve"> Pendiente  </w:t>
+              <w:t xml:space="preserve">☐ Pendiente  </w:t>
             </w:r>
             <w:r>
               <w:rPr>
@@ -7023,14 +7062,7 @@
                 <w:sz w:val="20"/>
                 <w:szCs w:val="20"/>
               </w:rPr>
-              <w:t>☐</w:t>
-            </w:r>
-            <w:r>
-              <w:rPr>
-                <w:sz w:val="20"/>
-                <w:szCs w:val="20"/>
-              </w:rPr>
-              <w:t xml:space="preserve"> Pendiente  </w:t>
+              <w:t xml:space="preserve">☐ Pendiente  </w:t>
             </w:r>
             <w:r>
               <w:rPr>
@@ -7128,14 +7160,7 @@
                 <w:sz w:val="20"/>
                 <w:szCs w:val="20"/>
               </w:rPr>
-              <w:t>☐</w:t>
-            </w:r>
-            <w:r>
-              <w:rPr>
-                <w:sz w:val="20"/>
-                <w:szCs w:val="20"/>
-              </w:rPr>
-              <w:t xml:space="preserve"> Pendiente  </w:t>
+              <w:t xml:space="preserve">☐ Pendiente  </w:t>
             </w:r>
             <w:r>
               <w:rPr>
@@ -7233,14 +7258,22 @@
                 <w:sz w:val="20"/>
                 <w:szCs w:val="20"/>
               </w:rPr>
-              <w:t>☐</w:t>
-            </w:r>
-            <w:r>
-              <w:rPr>
-                <w:sz w:val="20"/>
-                <w:szCs w:val="20"/>
-              </w:rPr>
-              <w:t xml:space="preserve"> Pendiente  ☐ Listo</w:t>
+              <w:t xml:space="preserve">☐ Pendiente  </w:t>
+            </w:r>
+            <w:r>
+              <w:rPr>
+                <w:rFonts w:ascii="Segoe UI Emoji" w:hAnsi="Segoe UI Emoji" w:cs="Segoe UI Emoji"/>
+                <w:sz w:val="20"/>
+                <w:szCs w:val="20"/>
+              </w:rPr>
+              <w:t>✅</w:t>
+            </w:r>
+            <w:r>
+              <w:rPr>
+                <w:sz w:val="20"/>
+                <w:szCs w:val="20"/>
+              </w:rPr>
+              <w:t xml:space="preserve"> Listo</w:t>
             </w:r>
           </w:p>
         </w:tc>
@@ -7323,14 +7356,22 @@
                 <w:sz w:val="20"/>
                 <w:szCs w:val="20"/>
               </w:rPr>
-              <w:t>☐</w:t>
-            </w:r>
-            <w:r>
-              <w:rPr>
-                <w:sz w:val="20"/>
-                <w:szCs w:val="20"/>
-              </w:rPr>
-              <w:t xml:space="preserve"> Pendiente  ☐ Listo</w:t>
+              <w:t xml:space="preserve">☐ Pendiente  </w:t>
+            </w:r>
+            <w:r>
+              <w:rPr>
+                <w:rFonts w:ascii="Segoe UI Emoji" w:hAnsi="Segoe UI Emoji" w:cs="Segoe UI Emoji"/>
+                <w:sz w:val="20"/>
+                <w:szCs w:val="20"/>
+              </w:rPr>
+              <w:t>✅</w:t>
+            </w:r>
+            <w:r>
+              <w:rPr>
+                <w:sz w:val="20"/>
+                <w:szCs w:val="20"/>
+              </w:rPr>
+              <w:t xml:space="preserve"> Listo</w:t>
             </w:r>
           </w:p>
         </w:tc>
@@ -7413,14 +7454,22 @@
                 <w:sz w:val="20"/>
                 <w:szCs w:val="20"/>
               </w:rPr>
-              <w:t>☐</w:t>
-            </w:r>
-            <w:r>
-              <w:rPr>
-                <w:sz w:val="20"/>
-                <w:szCs w:val="20"/>
-              </w:rPr>
-              <w:t xml:space="preserve"> Pendiente  ☐ Listo</w:t>
+              <w:t xml:space="preserve">☐ Pendiente  </w:t>
+            </w:r>
+            <w:r>
+              <w:rPr>
+                <w:rFonts w:ascii="Segoe UI Emoji" w:hAnsi="Segoe UI Emoji" w:cs="Segoe UI Emoji"/>
+                <w:sz w:val="20"/>
+                <w:szCs w:val="20"/>
+              </w:rPr>
+              <w:t>✅</w:t>
+            </w:r>
+            <w:r>
+              <w:rPr>
+                <w:sz w:val="20"/>
+                <w:szCs w:val="20"/>
+              </w:rPr>
+              <w:t xml:space="preserve"> Listo</w:t>
             </w:r>
           </w:p>
         </w:tc>
@@ -7449,6 +7498,7 @@
                 <w:sz w:val="20"/>
                 <w:szCs w:val="20"/>
               </w:rPr>
+              <w:lastRenderedPageBreak/>
               <w:t>URL del repositorio enviada/registrada al docente</w:t>
             </w:r>
           </w:p>
@@ -7503,14 +7553,7 @@
                 <w:sz w:val="20"/>
                 <w:szCs w:val="20"/>
               </w:rPr>
-              <w:t>☐</w:t>
-            </w:r>
-            <w:r>
-              <w:rPr>
-                <w:sz w:val="20"/>
-                <w:szCs w:val="20"/>
-              </w:rPr>
-              <w:t xml:space="preserve"> Pendiente  </w:t>
+              <w:t xml:space="preserve">☐ Pendiente  </w:t>
             </w:r>
             <w:r>
               <w:rPr>
@@ -7544,14 +7587,7 @@
         </w:pBdr>
       </w:pPr>
       <w:r>
-        <w:lastRenderedPageBreak/>
-        <w:t>⚠</w:t>
-      </w:r>
-      <w:r>
-        <w:t>️</w:t>
-      </w:r>
-      <w:r>
-        <w:t xml:space="preserve">  8 · Recordatorios Clave de la Evaluación</w:t>
+        <w:t>⚠️  8 · Recordatorios Clave de la Evaluación</w:t>
       </w:r>
     </w:p>
     <w:p>
@@ -7701,14 +7737,7 @@
                 <w:sz w:val="20"/>
                 <w:szCs w:val="20"/>
               </w:rPr>
-              <w:t xml:space="preserve">Semana 10 — antes de la primera sesión de </w:t>
-            </w:r>
-            <w:r>
-              <w:rPr>
-                <w:sz w:val="20"/>
-                <w:szCs w:val="20"/>
-              </w:rPr>
-              <w:t>evaluación</w:t>
+              <w:t>Semana 10 — antes de la primera sesión de evaluación</w:t>
             </w:r>
           </w:p>
         </w:tc>
@@ -8044,14 +8073,7 @@
                 <w:sz w:val="20"/>
                 <w:szCs w:val="20"/>
               </w:rPr>
-              <w:t xml:space="preserve">10 por equipo (sin máximo, con coherencia </w:t>
-            </w:r>
-            <w:r>
-              <w:rPr>
-                <w:sz w:val="20"/>
-                <w:szCs w:val="20"/>
-              </w:rPr>
-              <w:t>arquitectónica)</w:t>
+              <w:t>10 por equipo (sin máximo, con coherencia arquitectónica)</w:t>
             </w:r>
           </w:p>
         </w:tc>
@@ -8221,17 +8243,7 @@
                 <w:sz w:val="20"/>
                 <w:szCs w:val="20"/>
               </w:rPr>
-              <w:t xml:space="preserve">Si durante la defensa no puedes explicar el proyecto, ejecutarlo o modificar el </w:t>
-            </w:r>
-            <w:r>
-              <w:rPr>
-                <w:i/>
-                <w:iCs/>
-                <w:color w:val="1A3A5C"/>
-                <w:sz w:val="20"/>
-                <w:szCs w:val="20"/>
-              </w:rPr>
-              <w:t>código en tiempo real, se asume que no participaste activamente en el desarrollo, afectando tu nota individual independientemente de la calidad grupal del proyecto.</w:t>
+              <w:t>Si durante la defensa no puedes explicar el proyecto, ejecutarlo o modificar el código en tiempo real, se asume que no participaste activamente en el desarrollo, afectando tu nota individual independientemente de la calidad grupal del proyecto.</w:t>
             </w:r>
           </w:p>
         </w:tc>
@@ -8250,10 +8262,7 @@
         </w:pBdr>
       </w:pPr>
       <w:r>
-        <w:t>🚀</w:t>
-      </w:r>
-      <w:r>
-        <w:t xml:space="preserve">  9 · Próximos Pasos</w:t>
+        <w:t>🚀  9 · Próximos Pasos</w:t>
       </w:r>
     </w:p>
     <w:p>
@@ -8332,10 +8341,7 @@
         <w:t>Configurar application.properties</w:t>
       </w:r>
       <w:r>
-        <w:t xml:space="preserve"> — </w:t>
-      </w:r>
-      <w:r>
-        <w:t>datasource, dialecto JPA, puerto único por servicio.</w:t>
+        <w:t xml:space="preserve"> — datasource, dialecto JPA, puerto único por servicio.</w:t>
       </w:r>
     </w:p>
     <w:p>
@@ -8395,10 +8401,7 @@
         <w:t>Crear los primeros endpoints REST</w:t>
       </w:r>
       <w:r>
-        <w:t xml:space="preserve"> — siguiendo el patr</w:t>
-      </w:r>
-      <w:r>
-        <w:t>ón Controller → Service → Repository.</w:t>
+        <w:t xml:space="preserve"> — siguiendo el patrón Controller → Service → Repository.</w:t>
       </w:r>
     </w:p>
     <w:p>
@@ -8603,14 +8606,7 @@
                 <w:sz w:val="20"/>
                 <w:szCs w:val="20"/>
               </w:rPr>
-              <w:t>Endpoints</w:t>
-            </w:r>
-            <w:r>
-              <w:rPr>
-                <w:sz w:val="20"/>
-                <w:szCs w:val="20"/>
-              </w:rPr>
-              <w:t xml:space="preserve"> REST y controladores</w:t>
+              <w:t>Endpoints REST y controladores</w:t>
             </w:r>
           </w:p>
         </w:tc>
@@ -8666,6 +8662,7 @@
                 <w:sz w:val="20"/>
                 <w:szCs w:val="20"/>
               </w:rPr>
+              <w:lastRenderedPageBreak/>
               <w:t>Spring Data JPA</w:t>
             </w:r>
           </w:p>
@@ -8838,7 +8835,6 @@
                 <w:sz w:val="20"/>
                 <w:szCs w:val="20"/>
               </w:rPr>
-              <w:lastRenderedPageBreak/>
               <w:t>MySQL / PostgreSQL Driver</w:t>
             </w:r>
           </w:p>
@@ -8893,14 +8889,7 @@
                 <w:sz w:val="20"/>
                 <w:szCs w:val="20"/>
               </w:rPr>
-              <w:t>mysql-</w:t>
-            </w:r>
-            <w:r>
-              <w:rPr>
-                <w:sz w:val="20"/>
-                <w:szCs w:val="20"/>
-              </w:rPr>
-              <w:t>connector-j / postgresql</w:t>
+              <w:t>mysql-connector-j / postgresql</w:t>
             </w:r>
           </w:p>
         </w:tc>
@@ -9094,7 +9083,15 @@
           <w:sz w:val="18"/>
           <w:szCs w:val="18"/>
         </w:rPr>
-        <w:t>DSY1103 · Desarrollo FullStack 1 · 2025</w:t>
+        <w:t>DSY1103 · Desarrollo FullStack 1 · 202</w:t>
+      </w:r>
+      <w:r>
+        <w:rPr>
+          <w:color w:val="AED6F1"/>
+          <w:sz w:val="18"/>
+          <w:szCs w:val="18"/>
+        </w:rPr>
+        <w:t>6</w:t>
       </w:r>
     </w:p>
     <w:p>
@@ -9110,17 +9107,7 @@
           <w:sz w:val="16"/>
           <w:szCs w:val="16"/>
         </w:rPr>
-        <w:t>DuocUC</w:t>
-      </w:r>
-      <w:r>
-        <w:rPr>
-          <w:i/>
-          <w:iCs/>
-          <w:color w:val="88BBDD"/>
-          <w:sz w:val="16"/>
-          <w:szCs w:val="16"/>
-        </w:rPr>
-        <w:t xml:space="preserve"> — Subdirección de Diseño Instruccional</w:t>
+        <w:t>DuocUC — Subdirección de Diseño Instruccional</w:t>
       </w:r>
     </w:p>
     <w:sectPr>
@@ -9134,7 +9121,7 @@
 </file>
 
 <file path=word/numbering.xml><?xml version="1.0" encoding="utf-8"?>
-<w:numbering xmlns:wpc="http://schemas.microsoft.com/office/word/2010/wordprocessingCanvas" xmlns:cx="http://schemas.microsoft.com/office/drawing/2014/chartex" xmlns:cx1="http://schemas.microsoft.com/office/drawing/2015/9/8/chartex" xmlns:cx2="http://schemas.microsoft.com/office/drawing/2015/10/21/chartex" xmlns:cx3="http://schemas.microsoft.com/office/drawing/2016/5/9/chartex" xmlns:cx4="http://schemas.microsoft.com/office/drawing/2016/5/10/chartex" xmlns:cx5="http://schemas.microsoft.com/office/drawing/2016/5/11/chartex" xmlns:cx6="http://schemas.microsoft.com/office/drawing/2016/5/12/chartex" xmlns:cx7="http://schemas.microsoft.com/office/drawing/2016/5/13/chartex" xmlns:cx8="http://schemas.microsoft.com/office/drawing/2016/5/14/chartex" xmlns:mc="http://schemas.openxmlformats.org/markup-compatibility/2006" xmlns:aink="http://schemas.microsoft.com/office/drawing/2016/ink" xmlns:am3d="http://schemas.microsoft.com/office/drawing/2017/model3d" xmlns:o="urn:schemas-microsoft-com:office:office" xmlns:r="http://schemas.openxmlformats.org/officeDocument/2006/relationships" xmlns:m="http://schemas.openxmlformats.org/officeDocument/2006/math" xmlns:v="urn:schemas-microsoft-com:vml" xmlns:wp14="http://schemas.microsoft.com/office/word/2010/wordprocessingDrawing" xmlns:wp="http://schemas.openxmlformats.org/drawingml/2006/wordprocessingDrawing" xmlns:w10="urn:schemas-microsoft-com:office:word" xmlns:w="http://schemas.openxmlformats.org/wordprocessingml/2006/main" xmlns:w14="http://schemas.microsoft.com/office/word/2010/wordml" xmlns:w15="http://schemas.microsoft.com/office/word/2012/wordml" xmlns:w16cex="http://schemas.microsoft.com/office/word/2018/wordml/cex" xmlns:w16cid="http://schemas.microsoft.com/office/word/2016/wordml/cid" xmlns:w16="http://schemas.microsoft.com/office/word/2018/wordml" xmlns:w16sdtdh="http://schemas.microsoft.com/office/word/2020/wordml/sdtdatahash" xmlns:w16se="http://schemas.microsoft.com/office/word/2015/wordml/symex" xmlns:wpg="http://schemas.microsoft.com/office/word/2010/wordprocessingGroup" xmlns:wpi="http://schemas.microsoft.com/office/word/2010/wordprocessingInk" xmlns:wne="http://schemas.microsoft.com/office/word/2006/wordml" xmlns:wps="http://schemas.microsoft.com/office/word/2010/wordprocessingShape" mc:Ignorable="w14 w15 w16se w16cid w16 w16cex w16sdtdh wp14">
+<w:numbering xmlns:wpc="http://schemas.microsoft.com/office/word/2010/wordprocessingCanvas" xmlns:cx="http://schemas.microsoft.com/office/drawing/2014/chartex" xmlns:cx1="http://schemas.microsoft.com/office/drawing/2015/9/8/chartex" xmlns:cx2="http://schemas.microsoft.com/office/drawing/2015/10/21/chartex" xmlns:cx3="http://schemas.microsoft.com/office/drawing/2016/5/9/chartex" xmlns:cx4="http://schemas.microsoft.com/office/drawing/2016/5/10/chartex" xmlns:cx5="http://schemas.microsoft.com/office/drawing/2016/5/11/chartex" xmlns:cx6="http://schemas.microsoft.com/office/drawing/2016/5/12/chartex" xmlns:cx7="http://schemas.microsoft.com/office/drawing/2016/5/13/chartex" xmlns:cx8="http://schemas.microsoft.com/office/drawing/2016/5/14/chartex" xmlns:mc="http://schemas.openxmlformats.org/markup-compatibility/2006" xmlns:aink="http://schemas.microsoft.com/office/drawing/2016/ink" xmlns:am3d="http://schemas.microsoft.com/office/drawing/2017/model3d" xmlns:o="urn:schemas-microsoft-com:office:office" xmlns:oel="http://schemas.microsoft.com/office/2019/extlst" xmlns:r="http://schemas.openxmlformats.org/officeDocument/2006/relationships" xmlns:m="http://schemas.openxmlformats.org/officeDocument/2006/math" xmlns:v="urn:schemas-microsoft-com:vml" xmlns:wp14="http://schemas.microsoft.com/office/word/2010/wordprocessingDrawing" xmlns:wp="http://schemas.openxmlformats.org/drawingml/2006/wordprocessingDrawing" xmlns:w10="urn:schemas-microsoft-com:office:word" xmlns:w="http://schemas.openxmlformats.org/wordprocessingml/2006/main" xmlns:w14="http://schemas.microsoft.com/office/word/2010/wordml" xmlns:w15="http://schemas.microsoft.com/office/word/2012/wordml" xmlns:w16cex="http://schemas.microsoft.com/office/word/2018/wordml/cex" xmlns:w16cid="http://schemas.microsoft.com/office/word/2016/wordml/cid" xmlns:w16="http://schemas.microsoft.com/office/word/2018/wordml" xmlns:w16du="http://schemas.microsoft.com/office/word/2023/wordml/word16du" xmlns:w16sdtdh="http://schemas.microsoft.com/office/word/2020/wordml/sdtdatahash" xmlns:w16sdtfl="http://schemas.microsoft.com/office/word/2024/wordml/sdtformatlock" xmlns:w16se="http://schemas.microsoft.com/office/word/2015/wordml/symex" xmlns:wpg="http://schemas.microsoft.com/office/word/2010/wordprocessingGroup" xmlns:wpi="http://schemas.microsoft.com/office/word/2010/wordprocessingInk" xmlns:wne="http://schemas.microsoft.com/office/word/2006/wordml" xmlns:wps="http://schemas.microsoft.com/office/word/2010/wordprocessingShape" mc:Ignorable="w14 w15 w16se w16cid w16 w16cex w16sdtdh w16sdtfl w16du wp14">
   <w:abstractNum w:abstractNumId="0" w15:restartNumberingAfterBreak="0">
     <w:nsid w:val="2DF728E7"/>
     <w:multiLevelType w:val="hybridMultilevel"/>
@@ -9383,23 +9370,116 @@
       <w:lvlJc w:val="left"/>
     </w:lvl>
   </w:abstractNum>
-  <w:num w:numId="1">
+  <w:abstractNum w:abstractNumId="4" w15:restartNumberingAfterBreak="0">
+    <w:nsid w:val="765F6905"/>
+    <w:multiLevelType w:val="hybridMultilevel"/>
+    <w:tmpl w:val="4FBA08D6"/>
+    <w:lvl w:ilvl="0" w:tplc="340A000F">
+      <w:start w:val="1"/>
+      <w:numFmt w:val="decimal"/>
+      <w:lvlText w:val="%1."/>
+      <w:lvlJc w:val="left"/>
+      <w:pPr>
+        <w:ind w:left="720" w:hanging="360"/>
+      </w:pPr>
+      <w:rPr>
+        <w:rFonts w:hint="default"/>
+        <w:sz w:val="20"/>
+      </w:rPr>
+    </w:lvl>
+    <w:lvl w:ilvl="1" w:tplc="340A0019" w:tentative="1">
+      <w:start w:val="1"/>
+      <w:numFmt w:val="lowerLetter"/>
+      <w:lvlText w:val="%2."/>
+      <w:lvlJc w:val="left"/>
+      <w:pPr>
+        <w:ind w:left="1440" w:hanging="360"/>
+      </w:pPr>
+    </w:lvl>
+    <w:lvl w:ilvl="2" w:tplc="340A001B" w:tentative="1">
+      <w:start w:val="1"/>
+      <w:numFmt w:val="lowerRoman"/>
+      <w:lvlText w:val="%3."/>
+      <w:lvlJc w:val="right"/>
+      <w:pPr>
+        <w:ind w:left="2160" w:hanging="180"/>
+      </w:pPr>
+    </w:lvl>
+    <w:lvl w:ilvl="3" w:tplc="340A000F" w:tentative="1">
+      <w:start w:val="1"/>
+      <w:numFmt w:val="decimal"/>
+      <w:lvlText w:val="%4."/>
+      <w:lvlJc w:val="left"/>
+      <w:pPr>
+        <w:ind w:left="2880" w:hanging="360"/>
+      </w:pPr>
+    </w:lvl>
+    <w:lvl w:ilvl="4" w:tplc="340A0019" w:tentative="1">
+      <w:start w:val="1"/>
+      <w:numFmt w:val="lowerLetter"/>
+      <w:lvlText w:val="%5."/>
+      <w:lvlJc w:val="left"/>
+      <w:pPr>
+        <w:ind w:left="3600" w:hanging="360"/>
+      </w:pPr>
+    </w:lvl>
+    <w:lvl w:ilvl="5" w:tplc="340A001B" w:tentative="1">
+      <w:start w:val="1"/>
+      <w:numFmt w:val="lowerRoman"/>
+      <w:lvlText w:val="%6."/>
+      <w:lvlJc w:val="right"/>
+      <w:pPr>
+        <w:ind w:left="4320" w:hanging="180"/>
+      </w:pPr>
+    </w:lvl>
+    <w:lvl w:ilvl="6" w:tplc="340A000F" w:tentative="1">
+      <w:start w:val="1"/>
+      <w:numFmt w:val="decimal"/>
+      <w:lvlText w:val="%7."/>
+      <w:lvlJc w:val="left"/>
+      <w:pPr>
+        <w:ind w:left="5040" w:hanging="360"/>
+      </w:pPr>
+    </w:lvl>
+    <w:lvl w:ilvl="7" w:tplc="340A0019" w:tentative="1">
+      <w:start w:val="1"/>
+      <w:numFmt w:val="lowerLetter"/>
+      <w:lvlText w:val="%8."/>
+      <w:lvlJc w:val="left"/>
+      <w:pPr>
+        <w:ind w:left="5760" w:hanging="360"/>
+      </w:pPr>
+    </w:lvl>
+    <w:lvl w:ilvl="8" w:tplc="340A001B" w:tentative="1">
+      <w:start w:val="1"/>
+      <w:numFmt w:val="lowerRoman"/>
+      <w:lvlText w:val="%9."/>
+      <w:lvlJc w:val="right"/>
+      <w:pPr>
+        <w:ind w:left="6480" w:hanging="180"/>
+      </w:pPr>
+    </w:lvl>
+  </w:abstractNum>
+  <w:num w:numId="1" w16cid:durableId="317539521">
     <w:abstractNumId w:val="1"/>
     <w:lvlOverride w:ilvl="0">
       <w:startOverride w:val="1"/>
     </w:lvlOverride>
   </w:num>
-  <w:num w:numId="2">
+  <w:num w:numId="2" w16cid:durableId="1394037432">
     <w:abstractNumId w:val="0"/>
     <w:lvlOverride w:ilvl="0">
       <w:startOverride w:val="1"/>
     </w:lvlOverride>
   </w:num>
+  <w:num w:numId="3" w16cid:durableId="1720670454">
+    <w:abstractNumId w:val="4"/>
+  </w:num>
 </w:numbering>
 </file>
 
 <file path=word/styles.xml><?xml version="1.0" encoding="utf-8"?>
-<w:styles xmlns:mc="http://schemas.openxmlformats.org/markup-compatibility/2006" xmlns:r="http://schemas.openxmlformats.org/officeDocument/2006/relationships" xmlns:w="http://schemas.openxmlformats.org/wordprocessingml/2006/main" xmlns:w14="http://schemas.microsoft.com/office/word/2010/wordml" xmlns:w15="http://schemas.microsoft.com/office/word/2012/wordml" xmlns:w16cex="http://schemas.microsoft.com/office/word/2018/wordml/cex" xmlns:w16cid="http://schemas.microsoft.com/office/word/2016/wordml/cid" xmlns:w16="http://schemas.microsoft.com/office/word/2018/wordml" xmlns:w16sdtdh="http://schemas.microsoft.com/office/word/2020/wordml/sdtdatahash" xmlns:w16se="http://schemas.microsoft.com/office/word/2015/wordml/symex" mc:Ignorable="w14 w15 w16se w16cid w16 w16cex w16sdtdh">
+<w:styles xmlns:mc="http://schemas.openxmlformats.org/markup-compatibility/2006" xmlns:r="http://schemas.openxmlformats.org/officeDocument/2006/relationships" xmlns:w="http://schemas.openxmlformats.org/wordprocessingml/2006/main" xmlns:w14="http://schemas.microsoft.com/office/word/2010/wordml" xmlns:w15="http://schemas.microsoft.com/office/word/2012/wordml" xmlns:w16cex="http://schemas.microsoft.com/office/word/2018/wordml/cex" xmlns:w16cid="http://schemas.microsoft.com/office/word/2016/wordml/cid" xmlns:w16="http://schemas.microsoft.com/office/word/2018/wordml" xmlns:w16du="http://schemas.microsoft.com/office/word/2023/wordml/word16du" xmlns:w16sdtdh="http://schemas.microsoft.com/office/word/2020/wordml/sdtdatahash" xmlns:w16sdtfl="http://schemas.microsoft.com/office/word/2024/wordml/sdtformatlock" xmlns:w16se="http://schemas.microsoft.com/office/word/2015/wordml/symex" mc:Ignorable="w14 w15 w16se w16cid w16 w16cex w16sdtdh w16sdtfl w16du">
   <w:docDefaults>
     <w:rPrDefault>
       <w:rPr>
@@ -9887,7 +9967,6 @@
   <w:style w:type="character" w:default="1" w:styleId="Fuentedeprrafopredeter">
     <w:name w:val="Default Paragraph Font"/>
     <w:uiPriority w:val="1"/>
-    <w:semiHidden/>
     <w:unhideWhenUsed/>
   </w:style>
   <w:style w:type="table" w:default="1" w:styleId="Tablanormal">

</xml_diff>